<commit_message>
Deployed 8ab2ce01 with MkDocs version: 1.6.1
</commit_message>
<xml_diff>
--- a/download/accounting_point.docx
+++ b/download/accounting_point.docx
@@ -569,6 +569,78 @@
         <w:t xml:space="preserve">Common</w:t>
       </w:r>
     </w:p>
+    <w:p>
+      <w:pPr>
+        <w:pStyle w:val="FirstParagraph"/>
+      </w:pPr>
+      <w:r>
+        <w:t xml:space="preserve">No policies.</w:t>
+      </w:r>
+    </w:p>
+    <w:bookmarkEnd w:id="31"/>
+    <w:bookmarkStart w:id="32" w:name="balance-responsible-party"/>
+    <w:p>
+      <w:pPr>
+        <w:pStyle w:val="Overskrift4"/>
+      </w:pPr>
+      <w:r>
+        <w:t xml:space="preserve">Balance Responsible Party</w:t>
+      </w:r>
+    </w:p>
+    <w:p>
+      <w:pPr>
+        <w:pStyle w:val="FirstParagraph"/>
+      </w:pPr>
+      <w:r>
+        <w:t xml:space="preserve">No policies.</w:t>
+      </w:r>
+    </w:p>
+    <w:bookmarkEnd w:id="32"/>
+    <w:bookmarkStart w:id="33" w:name="end-user"/>
+    <w:p>
+      <w:pPr>
+        <w:pStyle w:val="Overskrift4"/>
+      </w:pPr>
+      <w:r>
+        <w:t xml:space="preserve">End User</w:t>
+      </w:r>
+    </w:p>
+    <w:p>
+      <w:pPr>
+        <w:pStyle w:val="FirstParagraph"/>
+      </w:pPr>
+      <w:r>
+        <w:t xml:space="preserve">No policies.</w:t>
+      </w:r>
+    </w:p>
+    <w:bookmarkEnd w:id="33"/>
+    <w:bookmarkStart w:id="34" w:name="energy-supplier"/>
+    <w:p>
+      <w:pPr>
+        <w:pStyle w:val="Overskrift4"/>
+      </w:pPr>
+      <w:r>
+        <w:t xml:space="preserve">Energy Supplier</w:t>
+      </w:r>
+    </w:p>
+    <w:p>
+      <w:pPr>
+        <w:pStyle w:val="FirstParagraph"/>
+      </w:pPr>
+      <w:r>
+        <w:t xml:space="preserve">No policies.</w:t>
+      </w:r>
+    </w:p>
+    <w:bookmarkEnd w:id="34"/>
+    <w:bookmarkStart w:id="35" w:name="flexibility-information-system-operator"/>
+    <w:p>
+      <w:pPr>
+        <w:pStyle w:val="Overskrift4"/>
+      </w:pPr>
+      <w:r>
+        <w:t xml:space="preserve">Flexibility Information System Operator</w:t>
+      </w:r>
+    </w:p>
     <w:tbl>
       <w:tblPr>
         <w:tblStyle w:val="Table"/>
@@ -626,7 +698,7 @@
               <w:pStyle w:val="Compact"/>
             </w:pPr>
             <w:r>
-              <w:t xml:space="preserve">AP-COM001</w:t>
+              <w:t xml:space="preserve">AP-FISO001</w:t>
             </w:r>
           </w:p>
         </w:tc>
@@ -654,78 +726,6 @@
         </w:tc>
       </w:tr>
     </w:tbl>
-    <w:bookmarkEnd w:id="31"/>
-    <w:bookmarkStart w:id="32" w:name="balance-responsible-party"/>
-    <w:p>
-      <w:pPr>
-        <w:pStyle w:val="Overskrift4"/>
-      </w:pPr>
-      <w:r>
-        <w:t xml:space="preserve">Balance Responsible Party</w:t>
-      </w:r>
-    </w:p>
-    <w:p>
-      <w:pPr>
-        <w:pStyle w:val="FirstParagraph"/>
-      </w:pPr>
-      <w:r>
-        <w:t xml:space="preserve">No policies.</w:t>
-      </w:r>
-    </w:p>
-    <w:bookmarkEnd w:id="32"/>
-    <w:bookmarkStart w:id="33" w:name="end-user"/>
-    <w:p>
-      <w:pPr>
-        <w:pStyle w:val="Overskrift4"/>
-      </w:pPr>
-      <w:r>
-        <w:t xml:space="preserve">End User</w:t>
-      </w:r>
-    </w:p>
-    <w:p>
-      <w:pPr>
-        <w:pStyle w:val="FirstParagraph"/>
-      </w:pPr>
-      <w:r>
-        <w:t xml:space="preserve">No policies.</w:t>
-      </w:r>
-    </w:p>
-    <w:bookmarkEnd w:id="33"/>
-    <w:bookmarkStart w:id="34" w:name="energy-supplier"/>
-    <w:p>
-      <w:pPr>
-        <w:pStyle w:val="Overskrift4"/>
-      </w:pPr>
-      <w:r>
-        <w:t xml:space="preserve">Energy Supplier</w:t>
-      </w:r>
-    </w:p>
-    <w:p>
-      <w:pPr>
-        <w:pStyle w:val="FirstParagraph"/>
-      </w:pPr>
-      <w:r>
-        <w:t xml:space="preserve">No policies.</w:t>
-      </w:r>
-    </w:p>
-    <w:bookmarkEnd w:id="34"/>
-    <w:bookmarkStart w:id="35" w:name="flexibility-information-system-operator"/>
-    <w:p>
-      <w:pPr>
-        <w:pStyle w:val="Overskrift4"/>
-      </w:pPr>
-      <w:r>
-        <w:t xml:space="preserve">Flexibility Information System Operator</w:t>
-      </w:r>
-    </w:p>
-    <w:p>
-      <w:pPr>
-        <w:pStyle w:val="FirstParagraph"/>
-      </w:pPr>
-      <w:r>
-        <w:t xml:space="preserve">No policies.</w:t>
-      </w:r>
-    </w:p>
     <w:bookmarkEnd w:id="35"/>
     <w:bookmarkStart w:id="36" w:name="organisation"/>
     <w:p>
@@ -754,14 +754,92 @@
         <w:t xml:space="preserve">System Operator</w:t>
       </w:r>
     </w:p>
-    <w:p>
-      <w:pPr>
-        <w:pStyle w:val="FirstParagraph"/>
-      </w:pPr>
-      <w:r>
-        <w:t xml:space="preserve">No policies.</w:t>
-      </w:r>
-    </w:p>
+    <w:tbl>
+      <w:tblPr>
+        <w:tblStyle w:val="Table"/>
+        <w:tblW w:type="pct" w:w="5000"/>
+        <w:tblLayout w:type="fixed"/>
+        <w:tblLook w:firstRow="1" w:lastRow="0" w:firstColumn="0" w:lastColumn="0" w:noHBand="0" w:noVBand="0" w:val="0020"/>
+      </w:tblPr>
+      <w:tblGrid>
+        <w:gridCol w:w="1250"/>
+        <w:gridCol w:w="5835"/>
+        <w:gridCol w:w="833"/>
+      </w:tblGrid>
+      <w:tr>
+        <w:trPr>
+          <w:tblHeader w:val="on"/>
+        </w:trPr>
+        <w:tc>
+          <w:tcPr/>
+          <w:p>
+            <w:pPr>
+              <w:pStyle w:val="Compact"/>
+            </w:pPr>
+            <w:r>
+              <w:t xml:space="preserve">Policy key</w:t>
+            </w:r>
+          </w:p>
+        </w:tc>
+        <w:tc>
+          <w:tcPr/>
+          <w:p>
+            <w:pPr>
+              <w:pStyle w:val="Compact"/>
+            </w:pPr>
+            <w:r>
+              <w:t xml:space="preserve">Policy</w:t>
+            </w:r>
+          </w:p>
+        </w:tc>
+        <w:tc>
+          <w:tcPr/>
+          <w:p>
+            <w:pPr>
+              <w:pStyle w:val="Compact"/>
+            </w:pPr>
+            <w:r>
+              <w:t xml:space="preserve">Status</w:t>
+            </w:r>
+          </w:p>
+        </w:tc>
+      </w:tr>
+      <w:tr>
+        <w:tc>
+          <w:tcPr/>
+          <w:p>
+            <w:pPr>
+              <w:pStyle w:val="Compact"/>
+            </w:pPr>
+            <w:r>
+              <w:t xml:space="preserve">AP-SO001</w:t>
+            </w:r>
+          </w:p>
+        </w:tc>
+        <w:tc>
+          <w:tcPr/>
+          <w:p>
+            <w:pPr>
+              <w:pStyle w:val="Compact"/>
+            </w:pPr>
+            <w:r>
+              <w:t xml:space="preserve">Read accounting points where they are CSO, ISO or PSO.</w:t>
+            </w:r>
+          </w:p>
+        </w:tc>
+        <w:tc>
+          <w:tcPr/>
+          <w:p>
+            <w:pPr>
+              <w:pStyle w:val="Compact"/>
+            </w:pPr>
+            <w:r>
+              <w:t xml:space="preserve">DONE</w:t>
+            </w:r>
+          </w:p>
+        </w:tc>
+      </w:tr>
+    </w:tbl>
     <w:bookmarkEnd w:id="37"/>
     <w:bookmarkStart w:id="38" w:name="service-provider"/>
     <w:p>
@@ -772,14 +850,92 @@
         <w:t xml:space="preserve">Service Provider</w:t>
       </w:r>
     </w:p>
-    <w:p>
-      <w:pPr>
-        <w:pStyle w:val="FirstParagraph"/>
-      </w:pPr>
-      <w:r>
-        <w:t xml:space="preserve">No policies.</w:t>
-      </w:r>
-    </w:p>
+    <w:tbl>
+      <w:tblPr>
+        <w:tblStyle w:val="Table"/>
+        <w:tblW w:type="pct" w:w="5000"/>
+        <w:tblLayout w:type="fixed"/>
+        <w:tblLook w:firstRow="1" w:lastRow="0" w:firstColumn="0" w:lastColumn="0" w:noHBand="0" w:noVBand="0" w:val="0020"/>
+      </w:tblPr>
+      <w:tblGrid>
+        <w:gridCol w:w="1131"/>
+        <w:gridCol w:w="6034"/>
+        <w:gridCol w:w="754"/>
+      </w:tblGrid>
+      <w:tr>
+        <w:trPr>
+          <w:tblHeader w:val="on"/>
+        </w:trPr>
+        <w:tc>
+          <w:tcPr/>
+          <w:p>
+            <w:pPr>
+              <w:pStyle w:val="Compact"/>
+            </w:pPr>
+            <w:r>
+              <w:t xml:space="preserve">Policy key</w:t>
+            </w:r>
+          </w:p>
+        </w:tc>
+        <w:tc>
+          <w:tcPr/>
+          <w:p>
+            <w:pPr>
+              <w:pStyle w:val="Compact"/>
+            </w:pPr>
+            <w:r>
+              <w:t xml:space="preserve">Policy</w:t>
+            </w:r>
+          </w:p>
+        </w:tc>
+        <w:tc>
+          <w:tcPr/>
+          <w:p>
+            <w:pPr>
+              <w:pStyle w:val="Compact"/>
+            </w:pPr>
+            <w:r>
+              <w:t xml:space="preserve">Status</w:t>
+            </w:r>
+          </w:p>
+        </w:tc>
+      </w:tr>
+      <w:tr>
+        <w:tc>
+          <w:tcPr/>
+          <w:p>
+            <w:pPr>
+              <w:pStyle w:val="Compact"/>
+            </w:pPr>
+            <w:r>
+              <w:t xml:space="preserve">AP-SP001</w:t>
+            </w:r>
+          </w:p>
+        </w:tc>
+        <w:tc>
+          <w:tcPr/>
+          <w:p>
+            <w:pPr>
+              <w:pStyle w:val="Compact"/>
+            </w:pPr>
+            <w:r>
+              <w:t xml:space="preserve">Read accounting points where they are or have been SP on a CU.</w:t>
+            </w:r>
+          </w:p>
+        </w:tc>
+        <w:tc>
+          <w:tcPr/>
+          <w:p>
+            <w:pPr>
+              <w:pStyle w:val="Compact"/>
+            </w:pPr>
+            <w:r>
+              <w:t xml:space="preserve">DONE</w:t>
+            </w:r>
+          </w:p>
+        </w:tc>
+      </w:tr>
+    </w:tbl>
     <w:bookmarkEnd w:id="38"/>
     <w:bookmarkStart w:id="39" w:name="third-party"/>
     <w:p>
@@ -1500,7 +1656,7 @@
     <w:bookmarkEnd w:id="43"/>
     <w:bookmarkEnd w:id="44"/>
     <w:sectPr>
-      <w:headerReference r:id="rId9" w:type="default"/>
+      <w:headerReference r:id="rId11" w:type="default"/>
       <w:pgSz w:h="11906" w:orient="landscape" w:w="16838"/>
       <w:pgMar w:bottom="1417" w:footer="708" w:gutter="0" w:header="708" w:left="1417" w:right="1417" w:top="1417"/>
       <w:cols w:space="708"/>

</xml_diff>

<commit_message>
Deployed a3855344 with MkDocs version: 1.6.1
</commit_message>
<xml_diff>
--- a/download/accounting_point.docx
+++ b/download/accounting_point.docx
@@ -120,10 +120,10 @@
         <w:tblLook w:firstRow="1" w:lastRow="0" w:firstColumn="0" w:lastColumn="0" w:noHBand="0" w:noVBand="0" w:val="0020"/>
       </w:tblPr>
       <w:tblGrid>
-        <w:gridCol w:w="2998"/>
-        <w:gridCol w:w="2216"/>
-        <w:gridCol w:w="1694"/>
-        <w:gridCol w:w="1010"/>
+        <w:gridCol w:w="2846"/>
+        <w:gridCol w:w="2505"/>
+        <w:gridCol w:w="1608"/>
+        <w:gridCol w:w="959"/>
       </w:tblGrid>
       <w:tr>
         <w:trPr>
@@ -329,6 +329,52 @@
                 <w:t xml:space="preserve">party.id</w:t>
               </w:r>
             </w:hyperlink>
+          </w:p>
+        </w:tc>
+      </w:tr>
+      <w:tr>
+        <w:tc>
+          <w:tcPr/>
+          <w:p>
+            <w:pPr>
+              <w:pStyle w:val="Compact"/>
+            </w:pPr>
+            <w:r>
+              <w:t xml:space="preserve">location</w:t>
+            </w:r>
+          </w:p>
+        </w:tc>
+        <w:tc>
+          <w:tcPr/>
+          <w:p>
+            <w:pPr>
+              <w:pStyle w:val="Compact"/>
+            </w:pPr>
+            <w:r>
+              <w:t xml:space="preserve">Geographic location of the accounting point (WGS84), as a GeoJSON point object.</w:t>
+            </w:r>
+          </w:p>
+        </w:tc>
+        <w:tc>
+          <w:tcPr/>
+          <w:p>
+            <w:pPr>
+              <w:pStyle w:val="Compact"/>
+            </w:pPr>
+            <w:r>
+              <w:t xml:space="preserve">Object</w:t>
+            </w:r>
+            <w:r>
+              <w:t xml:space="preserve">Read only</w:t>
+            </w:r>
+          </w:p>
+        </w:tc>
+        <w:tc>
+          <w:tcPr/>
+          <w:p>
+            <w:pPr>
+              <w:pStyle w:val="Compact"/>
+            </w:pPr>
           </w:p>
         </w:tc>
       </w:tr>
@@ -1342,6 +1388,112 @@
             </w:pPr>
             <w:r>
               <w:t xml:space="preserve">system_operator_id</w:t>
+            </w:r>
+          </w:p>
+        </w:tc>
+        <w:tc>
+          <w:tcPr/>
+          <w:p>
+            <w:pPr>
+              <w:pStyle w:val="Compact"/>
+            </w:pPr>
+          </w:p>
+        </w:tc>
+        <w:tc>
+          <w:tcPr/>
+          <w:p>
+            <w:pPr>
+              <w:pStyle w:val="Compact"/>
+            </w:pPr>
+            <w:r>
+              <w:t xml:space="preserve">R</w:t>
+            </w:r>
+          </w:p>
+        </w:tc>
+        <w:tc>
+          <w:tcPr/>
+          <w:p>
+            <w:pPr>
+              <w:pStyle w:val="Compact"/>
+            </w:pPr>
+            <w:r>
+              <w:t xml:space="preserve">R</w:t>
+            </w:r>
+          </w:p>
+        </w:tc>
+        <w:tc>
+          <w:tcPr/>
+          <w:p>
+            <w:pPr>
+              <w:pStyle w:val="Compact"/>
+            </w:pPr>
+            <w:r>
+              <w:t xml:space="preserve">R</w:t>
+            </w:r>
+          </w:p>
+        </w:tc>
+        <w:tc>
+          <w:tcPr/>
+          <w:p>
+            <w:pPr>
+              <w:pStyle w:val="Compact"/>
+            </w:pPr>
+            <w:r>
+              <w:t xml:space="preserve">R</w:t>
+            </w:r>
+          </w:p>
+        </w:tc>
+        <w:tc>
+          <w:tcPr/>
+          <w:p>
+            <w:pPr>
+              <w:pStyle w:val="Compact"/>
+            </w:pPr>
+            <w:r>
+              <w:t xml:space="preserve">R</w:t>
+            </w:r>
+          </w:p>
+        </w:tc>
+        <w:tc>
+          <w:tcPr/>
+          <w:p>
+            <w:pPr>
+              <w:pStyle w:val="Compact"/>
+            </w:pPr>
+            <w:r>
+              <w:t xml:space="preserve">R</w:t>
+            </w:r>
+          </w:p>
+        </w:tc>
+        <w:tc>
+          <w:tcPr/>
+          <w:p>
+            <w:pPr>
+              <w:pStyle w:val="Compact"/>
+            </w:pPr>
+            <w:r>
+              <w:t xml:space="preserve">R</w:t>
+            </w:r>
+          </w:p>
+        </w:tc>
+        <w:tc>
+          <w:tcPr/>
+          <w:p>
+            <w:pPr>
+              <w:pStyle w:val="Compact"/>
+            </w:pPr>
+          </w:p>
+        </w:tc>
+      </w:tr>
+      <w:tr>
+        <w:tc>
+          <w:tcPr/>
+          <w:p>
+            <w:pPr>
+              <w:pStyle w:val="Compact"/>
+            </w:pPr>
+            <w:r>
+              <w:t xml:space="preserve">location</w:t>
             </w:r>
           </w:p>
         </w:tc>

</xml_diff>

<commit_message>
Deployed f2b732a7 with MkDocs version: 1.6.1
</commit_message>
<xml_diff>
--- a/download/accounting_point.docx
+++ b/download/accounting_point.docx
@@ -633,14 +633,92 @@
         <w:t xml:space="preserve">Balance Responsible Party</w:t>
       </w:r>
     </w:p>
-    <w:p>
-      <w:pPr>
-        <w:pStyle w:val="FirstParagraph"/>
-      </w:pPr>
-      <w:r>
-        <w:t xml:space="preserve">No policies.</w:t>
-      </w:r>
-    </w:p>
+    <w:tbl>
+      <w:tblPr>
+        <w:tblStyle w:val="Table"/>
+        <w:tblW w:type="pct" w:w="5000"/>
+        <w:tblLayout w:type="fixed"/>
+        <w:tblLook w:firstRow="1" w:lastRow="0" w:firstColumn="0" w:lastColumn="0" w:noHBand="0" w:noVBand="0" w:val="0020"/>
+      </w:tblPr>
+      <w:tblGrid>
+        <w:gridCol w:w="1234"/>
+        <w:gridCol w:w="5862"/>
+        <w:gridCol w:w="822"/>
+      </w:tblGrid>
+      <w:tr>
+        <w:trPr>
+          <w:tblHeader w:val="on"/>
+        </w:trPr>
+        <w:tc>
+          <w:tcPr/>
+          <w:p>
+            <w:pPr>
+              <w:pStyle w:val="Compact"/>
+            </w:pPr>
+            <w:r>
+              <w:t xml:space="preserve">Policy key</w:t>
+            </w:r>
+          </w:p>
+        </w:tc>
+        <w:tc>
+          <w:tcPr/>
+          <w:p>
+            <w:pPr>
+              <w:pStyle w:val="Compact"/>
+            </w:pPr>
+            <w:r>
+              <w:t xml:space="preserve">Policy</w:t>
+            </w:r>
+          </w:p>
+        </w:tc>
+        <w:tc>
+          <w:tcPr/>
+          <w:p>
+            <w:pPr>
+              <w:pStyle w:val="Compact"/>
+            </w:pPr>
+            <w:r>
+              <w:t xml:space="preserve">Status</w:t>
+            </w:r>
+          </w:p>
+        </w:tc>
+      </w:tr>
+      <w:tr>
+        <w:tc>
+          <w:tcPr/>
+          <w:p>
+            <w:pPr>
+              <w:pStyle w:val="Compact"/>
+            </w:pPr>
+            <w:r>
+              <w:t xml:space="preserve">AP-BRP001</w:t>
+            </w:r>
+          </w:p>
+        </w:tc>
+        <w:tc>
+          <w:tcPr/>
+          <w:p>
+            <w:pPr>
+              <w:pStyle w:val="Compact"/>
+            </w:pPr>
+            <w:r>
+              <w:t xml:space="preserve">Read accounting points where they are currently BRP.</w:t>
+            </w:r>
+          </w:p>
+        </w:tc>
+        <w:tc>
+          <w:tcPr/>
+          <w:p>
+            <w:pPr>
+              <w:pStyle w:val="Compact"/>
+            </w:pPr>
+            <w:r>
+              <w:t xml:space="preserve">DONE</w:t>
+            </w:r>
+          </w:p>
+        </w:tc>
+      </w:tr>
+    </w:tbl>
     <w:bookmarkEnd w:id="32"/>
     <w:bookmarkStart w:id="33" w:name="end-user"/>
     <w:p>
@@ -803,14 +881,13 @@
     <w:tbl>
       <w:tblPr>
         <w:tblStyle w:val="Table"/>
-        <w:tblW w:type="pct" w:w="5000"/>
-        <w:tblLayout w:type="fixed"/>
+        <w:tblW w:type="auto" w:w="0"/>
         <w:tblLook w:firstRow="1" w:lastRow="0" w:firstColumn="0" w:lastColumn="0" w:noHBand="0" w:noVBand="0" w:val="0020"/>
       </w:tblPr>
       <w:tblGrid>
-        <w:gridCol w:w="1250"/>
-        <w:gridCol w:w="5835"/>
-        <w:gridCol w:w="833"/>
+        <w:gridCol w:w="2640"/>
+        <w:gridCol w:w="2640"/>
+        <w:gridCol w:w="2640"/>
       </w:tblGrid>
       <w:tr>
         <w:trPr>
@@ -869,7 +946,77 @@
               <w:pStyle w:val="Compact"/>
             </w:pPr>
             <w:r>
-              <w:t xml:space="preserve">Read accounting points where they are CSO, ISO or PSO.</w:t>
+              <w:t xml:space="preserve">Read accounting points where they are CSO</w:t>
+            </w:r>
+          </w:p>
+        </w:tc>
+        <w:tc>
+          <w:tcPr/>
+          <w:p>
+            <w:pPr>
+              <w:pStyle w:val="Compact"/>
+            </w:pPr>
+            <w:r>
+              <w:t xml:space="preserve">DONE</w:t>
+            </w:r>
+          </w:p>
+        </w:tc>
+      </w:tr>
+      <w:tr>
+        <w:tc>
+          <w:tcPr/>
+          <w:p>
+            <w:pPr>
+              <w:pStyle w:val="Compact"/>
+            </w:pPr>
+            <w:r>
+              <w:t xml:space="preserve">AP-SO002</w:t>
+            </w:r>
+          </w:p>
+        </w:tc>
+        <w:tc>
+          <w:tcPr/>
+          <w:p>
+            <w:pPr>
+              <w:pStyle w:val="Compact"/>
+            </w:pPr>
+            <w:r>
+              <w:t xml:space="preserve">Read accounting points where they are ISO.</w:t>
+            </w:r>
+          </w:p>
+        </w:tc>
+        <w:tc>
+          <w:tcPr/>
+          <w:p>
+            <w:pPr>
+              <w:pStyle w:val="Compact"/>
+            </w:pPr>
+            <w:r>
+              <w:t xml:space="preserve">DONE</w:t>
+            </w:r>
+          </w:p>
+        </w:tc>
+      </w:tr>
+      <w:tr>
+        <w:tc>
+          <w:tcPr/>
+          <w:p>
+            <w:pPr>
+              <w:pStyle w:val="Compact"/>
+            </w:pPr>
+            <w:r>
+              <w:t xml:space="preserve">AP-SO003</w:t>
+            </w:r>
+          </w:p>
+        </w:tc>
+        <w:tc>
+          <w:tcPr/>
+          <w:p>
+            <w:pPr>
+              <w:pStyle w:val="Compact"/>
+            </w:pPr>
+            <w:r>
+              <w:t xml:space="preserve">Read accounting points where they are PSO.</w:t>
             </w:r>
           </w:p>
         </w:tc>
@@ -1808,7 +1955,7 @@
     <w:bookmarkEnd w:id="43"/>
     <w:bookmarkEnd w:id="44"/>
     <w:sectPr>
-      <w:headerReference r:id="rId9" w:type="default"/>
+      <w:headerReference r:id="rId11" w:type="default"/>
       <w:pgSz w:h="11906" w:orient="landscape" w:w="16838"/>
       <w:pgMar w:bottom="1417" w:footer="708" w:gutter="0" w:header="708" w:left="1417" w:right="1417" w:top="1417"/>
       <w:cols w:space="708"/>

</xml_diff>